<commit_message>
docs: enrich Hafizh speaking script with real technical code snippets and natural developer tone
</commit_message>
<xml_diff>
--- a/docs/SPEECH-SCRIPT-ADMIN-HAFIZH.docx
+++ b/docs/SPEECH-SCRIPT-ADMIN-HAFIZH.docx
@@ -4,43 +4,43 @@
   <w:body>
     <w:p>
       <w:pPr>
-        <w:spacing w:after="40"/>
+        <w:spacing w:before="0" w:after="40"/>
       </w:pPr>
       <w:r>
         <w:rPr>
           <w:rFonts w:ascii="Calibri" w:hAnsi="Calibri"/>
           <w:b/>
           <w:color w:val="00529C"/>
-          <w:sz w:val="19"/>
+          <w:sz w:val="20"/>
         </w:rPr>
-        <w:t>⚡ LOMBA INOVASI PLN DIGITAL (PLN DIGI) • SPEAKING SCRIPT</w:t>
+        <w:t>PANDUAN TEKNIS &amp; NASKAH PRESENTASI DEVELOPER</w:t>
       </w:r>
     </w:p>
     <w:p>
       <w:pPr>
-        <w:spacing w:after="80"/>
+        <w:spacing w:before="40" w:after="40"/>
       </w:pPr>
       <w:r>
         <w:rPr>
           <w:rFonts w:ascii="Calibri" w:hAnsi="Calibri"/>
           <w:b/>
-          <w:color w:val="001A4D"/>
-          <w:sz w:val="44"/>
+          <w:color w:val="00265A"/>
+          <w:sz w:val="40"/>
         </w:rPr>
-        <w:t>Naskah Presentasi Lengkap (Full Speech Script)</w:t>
+        <w:t>Naskah Bicara Presentasi Admin PLN DIGI (Developer Script)</w:t>
       </w:r>
     </w:p>
     <w:p>
       <w:pPr>
-        <w:spacing w:after="280"/>
+        <w:spacing w:before="40" w:after="240"/>
       </w:pPr>
       <w:r>
         <w:rPr>
           <w:rFonts w:ascii="Calibri" w:hAnsi="Calibri"/>
-          <w:color w:val="64748B"/>
-          <w:sz w:val="24"/>
+          <w:color w:val="475569"/>
+          <w:sz w:val="22"/>
         </w:rPr>
-        <w:t>Pembicara: M. Hafizh Wijdan | Modul: Backoffice Command Center &amp; AI Document System | Durasi: 3 - 4 Menit</w:t>
+        <w:t>Disusun khusus untuk: M. Hafizh Wijdan | Total: 4 Slide | Durasi: 3.5 - 4 Menit</w:t>
       </w:r>
     </w:p>
     <w:tbl>
@@ -50,41 +50,46 @@
         <w:tblLook w:firstColumn="1" w:firstRow="1" w:lastColumn="0" w:lastRow="0" w:noHBand="0" w:noVBand="1" w:val="04A0"/>
       </w:tblPr>
       <w:tblGrid>
-        <w:gridCol w:w="4680"/>
-        <w:gridCol w:w="4680"/>
+        <w:gridCol w:w="4824"/>
+        <w:gridCol w:w="4824"/>
       </w:tblGrid>
       <w:tr>
         <w:tc>
           <w:tcPr>
-            <w:tcW w:type="dxa" w:w="2880"/>
+            <w:tcW w:type="dxa" w:w="3168"/>
+            <w:shd w:fill="F1F5F9"/>
           </w:tcPr>
           <w:p>
             <w:pPr>
-              <w:spacing w:before="40" w:after="40"/>
+              <w:spacing w:before="60" w:after="60"/>
             </w:pPr>
             <w:r>
               <w:rPr>
+                <w:rFonts w:ascii="Calibri" w:hAnsi="Calibri"/>
                 <w:b/>
-                <w:color w:val="00529C"/>
+                <w:color w:val="00265A"/>
                 <w:sz w:val="19"/>
               </w:rPr>
-              <w:t>Alokasi Slide</w:t>
+              <w:t>Pembicara</w:t>
             </w:r>
           </w:p>
         </w:tc>
         <w:tc>
           <w:tcPr>
             <w:tcW w:type="dxa" w:w="6480"/>
+            <w:shd w:fill="F8FAFC"/>
           </w:tcPr>
           <w:p>
             <w:pPr>
-              <w:spacing w:before="40" w:after="40"/>
+              <w:spacing w:before="60" w:after="60"/>
             </w:pPr>
             <w:r>
               <w:rPr>
+                <w:rFonts w:ascii="Calibri" w:hAnsi="Calibri"/>
+                <w:color w:val="0F172A"/>
                 <w:sz w:val="19"/>
               </w:rPr>
-              <w:t>4 Slide (Slide 1 s/d Slide 4)</w:t>
+              <w:t>M. Hafizh Wijdan (@202431005_M Hafizh Wijdan)</w:t>
             </w:r>
           </w:p>
         </w:tc>
@@ -92,35 +97,40 @@
       <w:tr>
         <w:tc>
           <w:tcPr>
-            <w:tcW w:type="dxa" w:w="2880"/>
+            <w:tcW w:type="dxa" w:w="3168"/>
+            <w:shd w:fill="F1F5F9"/>
           </w:tcPr>
           <w:p>
             <w:pPr>
-              <w:spacing w:before="40" w:after="40"/>
+              <w:spacing w:before="60" w:after="60"/>
             </w:pPr>
             <w:r>
               <w:rPr>
+                <w:rFonts w:ascii="Calibri" w:hAnsi="Calibri"/>
                 <w:b/>
-                <w:color w:val="00529C"/>
+                <w:color w:val="00265A"/>
                 <w:sz w:val="19"/>
               </w:rPr>
-              <w:t>Target Audiens</w:t>
+              <w:t>Modul yang Dipegang</w:t>
             </w:r>
           </w:p>
         </w:tc>
         <w:tc>
           <w:tcPr>
             <w:tcW w:type="dxa" w:w="6480"/>
+            <w:shd w:fill="F8FAFC"/>
           </w:tcPr>
           <w:p>
             <w:pPr>
-              <w:spacing w:before="40" w:after="40"/>
+              <w:spacing w:before="60" w:after="60"/>
             </w:pPr>
             <w:r>
               <w:rPr>
+                <w:rFonts w:ascii="Calibri" w:hAnsi="Calibri"/>
+                <w:color w:val="0F172A"/>
                 <w:sz w:val="19"/>
               </w:rPr>
-              <w:t>Dewan Juri Lomba PLN DIGI, Praktisi Teknologi BUMN, dan Akademisi</w:t>
+              <w:t>Backoffice Admin, CRM, Intelligent Operations, AI Document System</w:t>
             </w:r>
           </w:p>
         </w:tc>
@@ -128,35 +138,40 @@
       <w:tr>
         <w:tc>
           <w:tcPr>
-            <w:tcW w:type="dxa" w:w="2880"/>
+            <w:tcW w:type="dxa" w:w="3168"/>
+            <w:shd w:fill="F1F5F9"/>
           </w:tcPr>
           <w:p>
             <w:pPr>
-              <w:spacing w:before="40" w:after="40"/>
+              <w:spacing w:before="60" w:after="60"/>
             </w:pPr>
             <w:r>
               <w:rPr>
+                <w:rFonts w:ascii="Calibri" w:hAnsi="Calibri"/>
                 <w:b/>
-                <w:color w:val="00529C"/>
+                <w:color w:val="00265A"/>
                 <w:sz w:val="19"/>
               </w:rPr>
-              <w:t>Tone Suara</w:t>
+              <w:t>Teknologi Utama</w:t>
             </w:r>
           </w:p>
         </w:tc>
         <w:tc>
           <w:tcPr>
             <w:tcW w:type="dxa" w:w="6480"/>
+            <w:shd w:fill="F8FAFC"/>
           </w:tcPr>
           <w:p>
             <w:pPr>
-              <w:spacing w:before="40" w:after="40"/>
+              <w:spacing w:before="60" w:after="60"/>
             </w:pPr>
             <w:r>
               <w:rPr>
+                <w:rFonts w:ascii="Calibri" w:hAnsi="Calibri"/>
+                <w:color w:val="0F172A"/>
                 <w:sz w:val="19"/>
               </w:rPr>
-              <w:t>Percaya Diri, Lugas, Profesional, Menguasai Teknis, dan Berbobot</w:t>
+              <w:t>Laravel 13 MVC, MySQL 3NF, Eloquent Eager Loading, Alpine.js, CSS Print Engine</w:t>
             </w:r>
           </w:p>
         </w:tc>
@@ -164,35 +179,40 @@
       <w:tr>
         <w:tc>
           <w:tcPr>
-            <w:tcW w:type="dxa" w:w="2880"/>
+            <w:tcW w:type="dxa" w:w="3168"/>
+            <w:shd w:fill="F1F5F9"/>
           </w:tcPr>
           <w:p>
             <w:pPr>
-              <w:spacing w:before="40" w:after="40"/>
+              <w:spacing w:before="60" w:after="60"/>
             </w:pPr>
             <w:r>
               <w:rPr>
+                <w:rFonts w:ascii="Calibri" w:hAnsi="Calibri"/>
                 <w:b/>
-                <w:color w:val="00529C"/>
+                <w:color w:val="00265A"/>
                 <w:sz w:val="19"/>
               </w:rPr>
-              <w:t>Kata Kunci Emas</w:t>
+              <w:t>Karakter Presentasi</w:t>
             </w:r>
           </w:p>
         </w:tc>
         <w:tc>
           <w:tcPr>
             <w:tcW w:type="dxa" w:w="6480"/>
+            <w:shd w:fill="F8FAFC"/>
           </w:tcPr>
           <w:p>
             <w:pPr>
-              <w:spacing w:before="40" w:after="40"/>
+              <w:spacing w:before="60" w:after="60"/>
             </w:pPr>
             <w:r>
               <w:rPr>
+                <w:rFonts w:ascii="Calibri" w:hAnsi="Calibri"/>
+                <w:color w:val="0F172A"/>
                 <w:sz w:val="19"/>
               </w:rPr>
-              <w:t>Single Source of Truth, Aging Overdue, YANTEK Dispatch, SwaCAM Anomaly, AI-Ready JSON</w:t>
+              <w:t>Berbicara santai tapi berbobot, menguasai alur data dan baris kode, tanpa jargon AI klise</w:t>
             </w:r>
           </w:p>
         </w:tc>
@@ -200,56 +220,8 @@
     </w:tbl>
     <w:p>
       <w:pPr>
-        <w:spacing w:before="200" w:after="200"/>
+        <w:spacing w:after="120"/>
       </w:pPr>
-    </w:p>
-    <w:p>
-      <w:pPr>
-        <w:spacing w:before="280" w:after="120"/>
-      </w:pPr>
-      <w:r>
-        <w:rPr>
-          <w:rFonts w:ascii="Calibri" w:hAnsi="Calibri"/>
-          <w:b/>
-          <w:color w:val="00529C"/>
-          <w:sz w:val="28"/>
-        </w:rPr>
-        <w:t>1. Transisi Pembuka (Menerima Giliran Bicara dari Rekan)</w:t>
-      </w:r>
-    </w:p>
-    <w:p>
-      <w:pPr>
-        <w:spacing w:before="80" w:after="40"/>
-      </w:pPr>
-      <w:r>
-        <w:rPr>
-          <w:rFonts w:ascii="Calibri" w:hAnsi="Calibri"/>
-          <w:b/>
-          <w:i/>
-          <w:color w:val="B45309"/>
-          <w:sz w:val="19"/>
-        </w:rPr>
-        <w:t>👉 [PANDUAN PANGGUNG]: Tersenyum ramah, tatap juri, anggukkan kepala ke rekan yang selesai bicara. Badan tegak, suara mantap dan percaya diri.</w:t>
-      </w:r>
-    </w:p>
-    <w:p>
-      <w:pPr>
-        <w:spacing w:before="40" w:after="200" w:line="300" w:lineRule="auto"/>
-      </w:pPr>
-      <w:r>
-        <w:rPr>
-          <w:rFonts w:ascii="Georgia" w:hAnsi="Georgia"/>
-          <w:color w:val="1E293B"/>
-          <w:sz w:val="22"/>
-        </w:rPr>
-        <w:t>"Terima kasih rekan saya atas pemaparannya yang luar biasa.</w:t>
-        <w:br/>
-        <w:br/>
-        <w:t>Bapak, Ibu Dewan Juri yang saya hormati, jika di sisi pelanggan kita melihat antarmuka yang begitu mulus, cepat, dan ramah pengguna... maka pertanyaan terbesarnya adalah: Bagaimana operasional di balik layar PLN mengelola seluruh data, transaksi, dan tantangan di lapangan secara terintegrasi?</w:t>
-        <w:br/>
-        <w:br/>
-        <w:t>Perkenalkan, saya M. Hafizh Wijdan, dan dalam 4 slide ke depan, saya akan mengajak Bapak dan Ibu melihat bagaimana Backoffice Command Center PLN DIGI bekerja sebagai otak operasional kelistrikan modern."</w:t>
-      </w:r>
     </w:p>
     <w:tbl>
       <w:tblPr>
@@ -258,12 +230,12 @@
         <w:tblLook w:firstColumn="1" w:firstRow="1" w:lastColumn="0" w:lastRow="0" w:noHBand="0" w:noVBand="1" w:val="04A0"/>
       </w:tblPr>
       <w:tblGrid>
-        <w:gridCol w:w="9360"/>
+        <w:gridCol w:w="9648"/>
       </w:tblGrid>
       <w:tr>
         <w:tc>
           <w:tcPr>
-            <w:tcW w:type="dxa" w:w="9360"/>
+            <w:tcW w:type="dxa" w:w="9648"/>
             <w:shd w:fill="00265A"/>
           </w:tcPr>
           <w:p>
@@ -277,15 +249,16 @@
                 <w:color w:val="FFFFFF"/>
                 <w:sz w:val="22"/>
               </w:rPr>
-              <w:t xml:space="preserve">SLIDE 1: BACKOFFICE COMMAND CENTER &amp; CRM PELANGGAN </w:t>
+              <w:t xml:space="preserve">SLIDE 0 | TRANSISI MASUK &amp; PEMBUKA </w:t>
             </w:r>
             <w:r>
               <w:rPr>
                 <w:rFonts w:ascii="Calibri" w:hAnsi="Calibri"/>
+                <w:b/>
                 <w:color w:val="FDB813"/>
                 <w:sz w:val="20"/>
               </w:rPr>
-              <w:t>(~45 Detik)</w:t>
+              <w:t>[15 Detik]</w:t>
             </w:r>
           </w:p>
         </w:tc>
@@ -293,48 +266,16 @@
     </w:tbl>
     <w:p>
       <w:pPr>
-        <w:spacing w:after="40"/>
-      </w:pPr>
-    </w:p>
-    <w:p>
-      <w:pPr>
-        <w:spacing w:before="80" w:after="40"/>
+        <w:spacing w:before="120" w:after="40"/>
       </w:pPr>
       <w:r>
         <w:rPr>
           <w:rFonts w:ascii="Calibri" w:hAnsi="Calibri"/>
           <w:b/>
-          <w:i/>
           <w:color w:val="B45309"/>
           <w:sz w:val="19"/>
         </w:rPr>
-        <w:t>👉 [PANDUAN PANGGUNG]: Arahkan telapak tangan terbuka ke arah Slide 1. Berikan jeda 1 detik pada kata 'Single Source of Truth' dan '360 derajat'.</w:t>
-      </w:r>
-    </w:p>
-    <w:p>
-      <w:pPr>
-        <w:spacing w:before="40" w:after="200" w:line="300" w:lineRule="auto"/>
-      </w:pPr>
-      <w:r>
-        <w:rPr>
-          <w:rFonts w:ascii="Georgia" w:hAnsi="Georgia"/>
-          <w:color w:val="1E293B"/>
-          <w:sz w:val="22"/>
-        </w:rPr>
-        <w:t>"Kita mulai dari Command Center utama.</w:t>
-        <w:br/>
-        <w:br/>
-        <w:t>Selama ini, tantangan klasik utilitas besar adalah data yang terisolasi atau siloed. Di PLN DIGI, kami membangun dashboard admin sebagai Single Source of Truth.</w:t>
-        <w:br/>
-        <w:br/>
-        <w:t>Setiap detik, admin memiliki visibilitas 360 derajat:</w:t>
-        <w:br/>
-        <w:t>1. Mulai dari rekapitulasi transaksi real-time lintas kanal—baik pembayaran QRIS, Virtual Account, hingga pembelian token stroom.</w:t>
-        <w:br/>
-        <w:t>2. Hingga pengelolaan master data pelanggan, mulai dari golongan tarif Rumah Tangga subsidi 450 VA hingga industri bisnis berdaya tinggi.</w:t>
-        <w:br/>
-        <w:br/>
-        <w:t>Dan yang paling krusial: sistem ini dipagari dengan Role-Based Access Control berlapis. Ini menjamin privasi data jutaan pelanggan terlindungi, namun tim operasional tetap dapat mengaudit setiap transaksi dengan akurasi seratus persen."</w:t>
+        <w:t>🎙️ Cara Ngomong &amp; Bahasa Tubuh: Tersenyum santai, tatap dewan juri, intonasi tenang dan percaya diri. Jangan terburu-buru.</w:t>
       </w:r>
     </w:p>
     <w:tbl>
@@ -344,12 +285,54 @@
         <w:tblLook w:firstColumn="1" w:firstRow="1" w:lastColumn="0" w:lastRow="0" w:noHBand="0" w:noVBand="1" w:val="04A0"/>
       </w:tblPr>
       <w:tblGrid>
-        <w:gridCol w:w="9360"/>
+        <w:gridCol w:w="9648"/>
       </w:tblGrid>
       <w:tr>
         <w:tc>
           <w:tcPr>
-            <w:tcW w:type="dxa" w:w="9360"/>
+            <w:tcW w:type="dxa" w:w="9648"/>
+            <w:shd w:fill="F8FAFC"/>
+          </w:tcPr>
+          <w:p>
+            <w:pPr>
+              <w:spacing w:before="120" w:after="120" w:line="300" w:lineRule="auto"/>
+            </w:pPr>
+            <w:r>
+              <w:rPr>
+                <w:rFonts w:ascii="Georgia" w:hAnsi="Georgia"/>
+                <w:color w:val="0F172A"/>
+                <w:sz w:val="21"/>
+              </w:rPr>
+              <w:t>Terima kasih untuk rekan saya atas pemaparan sisi user dan desainnya.</w:t>
+              <w:br/>
+              <w:br/>
+              <w:t>Selamat pagi/siang Bapak dan Ibu Dewan Juri. Saya Hafizh Wijdan, dan saya bertanggung jawab atas arsitektur Backoffice dan Sistem Admin PLN DIGI.</w:t>
+              <w:br/>
+              <w:br/>
+              <w:t>Kalau tadi kita sudah melihat bagaimana pelanggan bisa bertransaksi dengan mudah dari aplikasi depan, sekarang kita masuk ke bagian vitalnya: bagaimana ratusan ribu data transaksi, penagihan, dan gangguan teknis ini dikelola oleh pihak PLN secara otomatis dan akurat di balik layar.</w:t>
+            </w:r>
+          </w:p>
+        </w:tc>
+      </w:tr>
+    </w:tbl>
+    <w:p>
+      <w:pPr>
+        <w:spacing w:after="80"/>
+      </w:pPr>
+    </w:p>
+    <w:tbl>
+      <w:tblPr>
+        <w:tblW w:type="auto" w:w="0"/>
+        <w:jc w:val="center"/>
+        <w:tblLook w:firstColumn="1" w:firstRow="1" w:lastColumn="0" w:lastRow="0" w:noHBand="0" w:noVBand="1" w:val="04A0"/>
+      </w:tblPr>
+      <w:tblGrid>
+        <w:gridCol w:w="9648"/>
+      </w:tblGrid>
+      <w:tr>
+        <w:tc>
+          <w:tcPr>
+            <w:tcW w:type="dxa" w:w="9648"/>
             <w:shd w:fill="00265A"/>
           </w:tcPr>
           <w:p>
@@ -363,15 +346,16 @@
                 <w:color w:val="FFFFFF"/>
                 <w:sz w:val="22"/>
               </w:rPr>
-              <w:t xml:space="preserve">SLIDE 2: INTELLIGENT OPERATIONAL &amp; TRIASE OTOMATIS </w:t>
+              <w:t xml:space="preserve">SLIDE 1 | BACKOFFICE COMMAND CENTER &amp; CRM PELANGGAN </w:t>
             </w:r>
             <w:r>
               <w:rPr>
                 <w:rFonts w:ascii="Calibri" w:hAnsi="Calibri"/>
+                <w:b/>
                 <w:color w:val="FDB813"/>
                 <w:sz w:val="20"/>
               </w:rPr>
-              <w:t>(~60 Detik)</w:t>
+              <w:t>[45 Detik]</w:t>
             </w:r>
           </w:p>
         </w:tc>
@@ -379,56 +363,16 @@
     </w:tbl>
     <w:p>
       <w:pPr>
-        <w:spacing w:after="40"/>
-      </w:pPr>
-    </w:p>
-    <w:p>
-      <w:pPr>
-        <w:spacing w:before="80" w:after="40"/>
+        <w:spacing w:before="120" w:after="40"/>
       </w:pPr>
       <w:r>
         <w:rPr>
           <w:rFonts w:ascii="Calibri" w:hAnsi="Calibri"/>
           <w:b/>
-          <w:i/>
           <w:color w:val="B45309"/>
           <w:sz w:val="19"/>
         </w:rPr>
-        <w:t>👉 [PANDUAN PANGGUNG]: Maju satu langkah kecil ke depan. Tekankan nada pada 3 poin utama (Aging Overdue, YANTEK, SwaCAM). Tatap dewan juri.</w:t>
-      </w:r>
-    </w:p>
-    <w:p>
-      <w:pPr>
-        <w:spacing w:before="40" w:after="200" w:line="300" w:lineRule="auto"/>
-      </w:pPr>
-      <w:r>
-        <w:rPr>
-          <w:rFonts w:ascii="Georgia" w:hAnsi="Georgia"/>
-          <w:color w:val="1E293B"/>
-          <w:sz w:val="22"/>
-        </w:rPr>
-        <w:t>"Namun, dashboard yang baik bukan hanya menampilkan angka—tetapi harus mampu mengambil tindakan secara cerdas. Di Slide kedua ini, kami menghadirkan modul Intelligent Operations.</w:t>
-        <w:br/>
-        <w:br/>
-        <w:t>Ada tiga pilar otomasi yang langsung menyelesaikan masalah riil PLN:</w:t>
-        <w:br/>
-        <w:br/>
-        <w:t>Pertama, Aging Overdue Matrix.</w:t>
-        <w:br/>
-        <w:t>Sistem kami secara otomatis mengklasifikasikan status tagihan pelanggan yang menunggak secara bertingkat: mulai dari status Lancar, Surat Peringatan 1 (SP-1), Peringatan Keras (SP-2), hingga penerbitan Surat Perintah Kerja (SPK) pemutusan sementara.</w:t>
-        <w:br/>
-        <w:br/>
-        <w:t>Kedua, Triase Tiket YANTEK (Pelayanan Teknik).</w:t>
-        <w:br/>
-        <w:t>Ketika pelanggan melaporkan gangguan listrik melalui aplikasi, sistem admin langsung memilah keparahannya secara otomatis antara insiden Kritis dan Normal, sehingga teknisi lapangan dapat segera di-dispatch dengan Response Time yang jauh lebih cepat.</w:t>
-        <w:br/>
-        <w:br/>
-        <w:t>Ketiga, Audit SwaCAM Anomaly Detection.</w:t>
-        <w:br/>
-        <w:t>Ketika pelanggan mengunggah foto angka stand meter mandiri, sistem kami langsung memvalidasi angka tersebut. Jika ada anomali lonjakan ekstrem di atas 400 kWh atau penurunan drastis tidak wajar, sistem langsung menandainya untuk diverifikasi sebelum tagihan diterbitkan.</w:t>
-        <w:br/>
-        <w:br/>
-        <w:t>Inilah esensi dari Revenue Assurance: mencegah kebocoran pendapatan dan melindungi hak pelanggan secara bersamaan."</w:t>
+        <w:t>🎙️ Cara Ngomong &amp; Bahasa Tubuh: Tunjuk layar atau klik pointer ke grafik transaksi dan tabel pelanggan. Tekankan kata 'Single Source of Truth' dan 'Role-Based Middleware'.</w:t>
       </w:r>
     </w:p>
     <w:tbl>
@@ -438,12 +382,143 @@
         <w:tblLook w:firstColumn="1" w:firstRow="1" w:lastColumn="0" w:lastRow="0" w:noHBand="0" w:noVBand="1" w:val="04A0"/>
       </w:tblPr>
       <w:tblGrid>
-        <w:gridCol w:w="9360"/>
+        <w:gridCol w:w="9648"/>
       </w:tblGrid>
       <w:tr>
         <w:tc>
           <w:tcPr>
-            <w:tcW w:type="dxa" w:w="9360"/>
+            <w:tcW w:type="dxa" w:w="9648"/>
+            <w:shd w:fill="F8FAFC"/>
+          </w:tcPr>
+          <w:p>
+            <w:pPr>
+              <w:spacing w:before="120" w:after="120" w:line="300" w:lineRule="auto"/>
+            </w:pPr>
+            <w:r>
+              <w:rPr>
+                <w:rFonts w:ascii="Georgia" w:hAnsi="Georgia"/>
+                <w:color w:val="0F172A"/>
+                <w:sz w:val="21"/>
+              </w:rPr>
+              <w:t>Di slide pertama ini, kita melihat Command Center utama yang menjadi Single Source of Truth bagi operasional PLN.</w:t>
+              <w:br/>
+              <w:br/>
+              <w:t>Tantangan terbesar sistem utilitas biasanya ada pada fragmentasi data: tagihan terpisah, catatan meter terpisah, dan status pelanggan sulit dicari cepat. Di sini, kami menyatukannya ke dalam satu dashboard terintegrasi.</w:t>
+              <w:br/>
+              <w:br/>
+              <w:t>Admin bisa langsung memonitor arus kas harian dari multi-channel pembayaran—mulai dari QRIS instan hingga Virtual Account bank—sekaligus memantau data master pelanggan lintas golongan tarif, baik Rumah Tangga subsidi 450 VA sampai Bisnis dan Industri.</w:t>
+              <w:br/>
+              <w:br/>
+              <w:t>Dari sisi keamanan, modul ini tidak bisa diakses sembarangan. Kami menerapkan Role-Based Middleware berlapis pada rute /admin, sehingga session pelanggan biasa yang mencoba masuk akan otomatis di-block.</w:t>
+            </w:r>
+          </w:p>
+        </w:tc>
+      </w:tr>
+    </w:tbl>
+    <w:p>
+      <w:pPr>
+        <w:spacing w:after="80"/>
+      </w:pPr>
+    </w:p>
+    <w:p>
+      <w:pPr>
+        <w:spacing w:before="120" w:after="40"/>
+      </w:pPr>
+      <w:r>
+        <w:rPr>
+          <w:rFonts w:ascii="Calibri" w:hAnsi="Calibri"/>
+          <w:b/>
+          <w:color w:val="00529C"/>
+          <w:sz w:val="20"/>
+        </w:rPr>
+        <w:t>⚙️ Bedah Teknis &amp; Kode Terkait: Eager Loading &amp; Aggregation di Dashboard Controller</w:t>
+      </w:r>
+    </w:p>
+    <w:tbl>
+      <w:tblPr>
+        <w:tblW w:type="auto" w:w="0"/>
+        <w:jc w:val="center"/>
+        <w:tblLook w:firstColumn="1" w:firstRow="1" w:lastColumn="0" w:lastRow="0" w:noHBand="0" w:noVBand="1" w:val="04A0"/>
+      </w:tblPr>
+      <w:tblGrid>
+        <w:gridCol w:w="9648"/>
+      </w:tblGrid>
+      <w:tr>
+        <w:tc>
+          <w:tcPr>
+            <w:tcW w:type="dxa" w:w="9648"/>
+            <w:shd w:fill="0F172A"/>
+          </w:tcPr>
+          <w:p>
+            <w:pPr>
+              <w:spacing w:before="80" w:after="40"/>
+            </w:pPr>
+            <w:r>
+              <w:rPr>
+                <w:rFonts w:ascii="Consolas" w:hAnsi="Consolas"/>
+                <w:color w:val="94A3B8"/>
+                <w:sz w:val="17"/>
+              </w:rPr>
+              <w:t>// File: app/Http/Controllers/Admin/AdminController.php</w:t>
+            </w:r>
+          </w:p>
+          <w:p>
+            <w:pPr>
+              <w:spacing w:before="0" w:after="80"/>
+            </w:pPr>
+            <w:r>
+              <w:rPr>
+                <w:rFonts w:ascii="Consolas" w:hAnsi="Consolas"/>
+                <w:color w:val="E2E8F0"/>
+                <w:sz w:val="17"/>
+              </w:rPr>
+              <w:t>$stats = [</w:t>
+              <w:br/>
+              <w:t xml:space="preserve">    'total_pelanggan'     =&gt; Customer::count(),</w:t>
+              <w:br/>
+              <w:t xml:space="preserve">    'pendapatan'          =&gt; Transaction::where('status', 'success')-&gt;sum('amount'),</w:t>
+              <w:br/>
+              <w:t xml:space="preserve">    'tagihan_belum_lunas' =&gt; Bill::whereIn('status', ['unpaid', 'overdue'])-&gt;count(),</w:t>
+              <w:br/>
+              <w:t xml:space="preserve">    'gangguan_aktif'      =&gt; OutageReport::whereIn('status', ['dilaporkan', 'diproses'])-&gt;count(),</w:t>
+              <w:br/>
+              <w:t>];</w:t>
+              <w:br/>
+              <w:t>$recentTransactions = Transaction::with(['user', 'customer', 'paymentMethod'])</w:t>
+              <w:br/>
+              <w:t xml:space="preserve">    -&gt;latest()-&gt;take(8)-&gt;get();</w:t>
+            </w:r>
+          </w:p>
+        </w:tc>
+      </w:tr>
+    </w:tbl>
+    <w:p>
+      <w:pPr>
+        <w:spacing w:before="60" w:after="200"/>
+      </w:pPr>
+      <w:r>
+        <w:rPr>
+          <w:rFonts w:ascii="Calibri" w:hAnsi="Calibri"/>
+          <w:i/>
+          <w:color w:val="475569"/>
+          <w:sz w:val="18"/>
+        </w:rPr>
+        <w:t>Poin teknis untuk dijelaskan jika juri bertanya: Kita memakai Eager Loading (`with`) pada relasi Customer, User, dan PaymentMethod untuk menghindari masalah N+1 Query sehingga dashboard tetap ringan meski data transaksi berjumlah puluhan ribu.</w:t>
+      </w:r>
+    </w:p>
+    <w:tbl>
+      <w:tblPr>
+        <w:tblW w:type="auto" w:w="0"/>
+        <w:jc w:val="center"/>
+        <w:tblLook w:firstColumn="1" w:firstRow="1" w:lastColumn="0" w:lastRow="0" w:noHBand="0" w:noVBand="1" w:val="04A0"/>
+      </w:tblPr>
+      <w:tblGrid>
+        <w:gridCol w:w="9648"/>
+      </w:tblGrid>
+      <w:tr>
+        <w:tc>
+          <w:tcPr>
+            <w:tcW w:type="dxa" w:w="9648"/>
             <w:shd w:fill="00265A"/>
           </w:tcPr>
           <w:p>
@@ -457,15 +532,16 @@
                 <w:color w:val="FFFFFF"/>
                 <w:sz w:val="22"/>
               </w:rPr>
-              <w:t xml:space="preserve">SLIDE 3: OFFICIAL DOCUMENT GENERATOR &amp; AI AGENT BRIDGE </w:t>
+              <w:t xml:space="preserve">SLIDE 2 | INTELLIGENT OPERATIONS: PENAGIHAN BERTINGKAT &amp; TRIASE LAPANGAN </w:t>
             </w:r>
             <w:r>
               <w:rPr>
                 <w:rFonts w:ascii="Calibri" w:hAnsi="Calibri"/>
+                <w:b/>
                 <w:color w:val="FDB813"/>
                 <w:sz w:val="20"/>
               </w:rPr>
-              <w:t>(~60 Detik)</w:t>
+              <w:t>[60 Detik]</w:t>
             </w:r>
           </w:p>
         </w:tc>
@@ -473,55 +549,16 @@
     </w:tbl>
     <w:p>
       <w:pPr>
-        <w:spacing w:after="40"/>
-      </w:pPr>
-    </w:p>
-    <w:p>
-      <w:pPr>
-        <w:spacing w:before="80" w:after="40"/>
+        <w:spacing w:before="120" w:after="40"/>
       </w:pPr>
       <w:r>
         <w:rPr>
           <w:rFonts w:ascii="Calibri" w:hAnsi="Calibri"/>
           <w:b/>
-          <w:i/>
           <w:color w:val="B45309"/>
           <w:sz w:val="19"/>
         </w:rPr>
-        <w:t>👉 [PANDUAN PANGGUNG]: Tangan terbuka mengarah ke slide, ekspresi bangga dan meyakinkan. Ini adalah 'Golden Moment' presentasi kamu!</w:t>
-      </w:r>
-    </w:p>
-    <w:p>
-      <w:pPr>
-        <w:spacing w:before="40" w:after="200" w:line="300" w:lineRule="auto"/>
-      </w:pPr>
-      <w:r>
-        <w:rPr>
-          <w:rFonts w:ascii="Georgia" w:hAnsi="Georgia"/>
-          <w:color w:val="1E293B"/>
-          <w:sz w:val="22"/>
-        </w:rPr>
-        <w:t>"Bapak dan Ibu Dewan Juri, ini adalah inovasi yang paling kami banggakan di bagian backoffice: Official Document Generator &amp; AI Agent Bridge.</w:t>
-        <w:br/>
-        <w:br/>
-        <w:t>Di dunia nyata, staf administrasi PLN sering menghabiskan waktu berjam-jam untuk menyusun naskah dinas, mencocokkan nomor surat, dan mengecek rincian tunggakan satu per satu.</w:t>
-        <w:br/>
-        <w:br/>
-        <w:t>Di sistem kami, proses berjam-jam tersebut kami pangkas menjadi satu kali klik.</w:t>
-        <w:br/>
-        <w:br/>
-        <w:t>Sistem menyediakan 4 template kedinasan standar BUMN:</w:t>
-        <w:br/>
-        <w:t>Surat Peringatan 1, Surat Peringatan 2, SPK Bongkar Rampung, serta Surat Tugas Tim Pelayanan Teknik.</w:t>
-        <w:br/>
-        <w:br/>
-        <w:t>Yang istimewa, dokumen yang dihasilkan bukan sekadar template biasa:</w:t>
-        <w:br/>
-        <w:t>• Pertama, Legalitasnya Patuh Regulasi: nomor surat ter-generate otomatis mengikuti tata naskah dinas PLN dan mencantumkan konsideran dasar hukum Peraturan Menteri ESDM yang berlaku.</w:t>
-        <w:br/>
-        <w:t>• Kedua, High-Precision A4 Print Engine: siap cetak atau simpan ke PDF dengan standar tata letak resmi kop PLN tanpa dependensi library pihak ketiga yang memberatkan server.</w:t>
-        <w:br/>
-        <w:t>• Dan ketiga, yang paling visioner: AI-Agent Ready. Kami telah merancang endpoint dan JSON Schema terstruktur di sistem ini, sehingga naskah dinas dan notifikasi WhatsApp broadcast ke pelanggan siap digenerate dan dikirimkan secara otomatis oleh model AI (LLM) di masa depan!"</w:t>
+        <w:t>🎙️ Cara Ngomong &amp; Bahasa Tubuh: Gunakan tangan untuk memperagakan alur bertingkat (SP-1 ke SP-2 ke SPK). Nada bicara tegas saat menyebut 'Revenue Assurance'.</w:t>
       </w:r>
     </w:p>
     <w:tbl>
@@ -531,12 +568,146 @@
         <w:tblLook w:firstColumn="1" w:firstRow="1" w:lastColumn="0" w:lastRow="0" w:noHBand="0" w:noVBand="1" w:val="04A0"/>
       </w:tblPr>
       <w:tblGrid>
-        <w:gridCol w:w="9360"/>
+        <w:gridCol w:w="9648"/>
       </w:tblGrid>
       <w:tr>
         <w:tc>
           <w:tcPr>
-            <w:tcW w:type="dxa" w:w="9360"/>
+            <w:tcW w:type="dxa" w:w="9648"/>
+            <w:shd w:fill="F8FAFC"/>
+          </w:tcPr>
+          <w:p>
+            <w:pPr>
+              <w:spacing w:before="120" w:after="120" w:line="300" w:lineRule="auto"/>
+            </w:pPr>
+            <w:r>
+              <w:rPr>
+                <w:rFonts w:ascii="Georgia" w:hAnsi="Georgia"/>
+                <w:color w:val="0F172A"/>
+                <w:sz w:val="21"/>
+              </w:rPr>
+              <w:t>Masuk ke slide kedua, sistem ini tidak hanya pasif menampilkan tabel, melainkan menjalankan business logic cerdas secara otomatis.</w:t>
+              <w:br/>
+              <w:br/>
+              <w:t>Pertama, kami membangun Aging Overdue Matrix untuk tagihan pascabayar. Sistem secara otomatis mengkalkulasi tanggal jatuh tempo. Tagihan yang lewat tanggal 20 otomatis diklasifikasikan ke status Overdue dan langsung masuk pipeline penagihan bertingkat: dari SP-1, SP-2 peringatan keras, hingga penerbitan SPK pemutusan.</w:t>
+              <w:br/>
+              <w:br/>
+              <w:t>Kedua, pada modul Pengaduan Gangguan atau YANTEK, sistem melakukan triase keparahan otomatis. Laporan pemadaman total atau korsleting langsung di-flag sebagai status 'Kritis' dan dinaikkan ke antrean teratas agar teknisi lapangan bisa langsung di-dispatch dalam hitungan menit.</w:t>
+              <w:br/>
+              <w:br/>
+              <w:t>Dan ketiga, ada Audit SwaCAM Anomaly Detection. Ketika pelanggan mengunggah foto angka stand meter mandiri, controller kami memvalidasi lonjakan kWh. Jika angka melonjak di atas 400 kWh atau anomali turun drastis, statusnya ditandai untuk diverifikasi petugas sebelum tagihan dicetak. Ini melindungi hak konsumen sekaligus menjaga Revenue Assurance PLN.</w:t>
+            </w:r>
+          </w:p>
+        </w:tc>
+      </w:tr>
+    </w:tbl>
+    <w:p>
+      <w:pPr>
+        <w:spacing w:after="80"/>
+      </w:pPr>
+    </w:p>
+    <w:p>
+      <w:pPr>
+        <w:spacing w:before="120" w:after="40"/>
+      </w:pPr>
+      <w:r>
+        <w:rPr>
+          <w:rFonts w:ascii="Calibri" w:hAnsi="Calibri"/>
+          <w:b/>
+          <w:color w:val="00529C"/>
+          <w:sz w:val="20"/>
+        </w:rPr>
+        <w:t>⚙️ Bedah Teknis &amp; Kode Terkait: Query Filter Aging Overdue &amp; Severity Triase</w:t>
+      </w:r>
+    </w:p>
+    <w:tbl>
+      <w:tblPr>
+        <w:tblW w:type="auto" w:w="0"/>
+        <w:jc w:val="center"/>
+        <w:tblLook w:firstColumn="1" w:firstRow="1" w:lastColumn="0" w:lastRow="0" w:noHBand="0" w:noVBand="1" w:val="04A0"/>
+      </w:tblPr>
+      <w:tblGrid>
+        <w:gridCol w:w="9648"/>
+      </w:tblGrid>
+      <w:tr>
+        <w:tc>
+          <w:tcPr>
+            <w:tcW w:type="dxa" w:w="9648"/>
+            <w:shd w:fill="0F172A"/>
+          </w:tcPr>
+          <w:p>
+            <w:pPr>
+              <w:spacing w:before="80" w:after="40"/>
+            </w:pPr>
+            <w:r>
+              <w:rPr>
+                <w:rFonts w:ascii="Consolas" w:hAnsi="Consolas"/>
+                <w:color w:val="94A3B8"/>
+                <w:sz w:val="17"/>
+              </w:rPr>
+              <w:t>// File: app/Http/Controllers/Admin/AdminController.php</w:t>
+            </w:r>
+          </w:p>
+          <w:p>
+            <w:pPr>
+              <w:spacing w:before="0" w:after="80"/>
+            </w:pPr>
+            <w:r>
+              <w:rPr>
+                <w:rFonts w:ascii="Consolas" w:hAnsi="Consolas"/>
+                <w:color w:val="E2E8F0"/>
+                <w:sz w:val="17"/>
+              </w:rPr>
+              <w:t>// Logika Aging Overdue Penagihan Bertingkat</w:t>
+              <w:br/>
+              <w:t>$query-&gt;where('status', 'overdue')</w:t>
+              <w:br/>
+              <w:t xml:space="preserve">      -&gt;orWhere(function ($sub) {</w:t>
+              <w:br/>
+              <w:t xml:space="preserve">          $sub-&gt;where('status', 'unpaid')</w:t>
+              <w:br/>
+              <w:t xml:space="preserve">              -&gt;where('tanggal_jatuh_tempo', '&lt;', now()-&gt;toDateString());</w:t>
+              <w:br/>
+              <w:t xml:space="preserve">      });</w:t>
+              <w:br/>
+              <w:br/>
+              <w:t>// Triase Tiket Kritis YANTEK</w:t>
+              <w:br/>
+              <w:t>$kritis = OutageReport::whereIn('kategori', ['padam_total', 'korsleting'])</w:t>
+              <w:br/>
+              <w:t xml:space="preserve">                      -&gt;whereIn('status', ['dilaporkan', 'diproses'])-&gt;count();</w:t>
+            </w:r>
+          </w:p>
+        </w:tc>
+      </w:tr>
+    </w:tbl>
+    <w:p>
+      <w:pPr>
+        <w:spacing w:before="60" w:after="200"/>
+      </w:pPr>
+      <w:r>
+        <w:rPr>
+          <w:rFonts w:ascii="Calibri" w:hAnsi="Calibri"/>
+          <w:i/>
+          <w:color w:val="475569"/>
+          <w:sz w:val="18"/>
+        </w:rPr>
+        <w:t>Poin teknis untuk dijelaskan jika juri bertanya: Filtering jatuh tempo menggunakan query scope berbasis waktu server, memastikan akurasi denda dan status hukum penagihan secara real-time tanpa delay batch harian.</w:t>
+      </w:r>
+    </w:p>
+    <w:tbl>
+      <w:tblPr>
+        <w:tblW w:type="auto" w:w="0"/>
+        <w:jc w:val="center"/>
+        <w:tblLook w:firstColumn="1" w:firstRow="1" w:lastColumn="0" w:lastRow="0" w:noHBand="0" w:noVBand="1" w:val="04A0"/>
+      </w:tblPr>
+      <w:tblGrid>
+        <w:gridCol w:w="9648"/>
+      </w:tblGrid>
+      <w:tr>
+        <w:tc>
+          <w:tcPr>
+            <w:tcW w:type="dxa" w:w="9648"/>
             <w:shd w:fill="00265A"/>
           </w:tcPr>
           <w:p>
@@ -550,15 +721,16 @@
                 <w:color w:val="FFFFFF"/>
                 <w:sz w:val="22"/>
               </w:rPr>
-              <w:t xml:space="preserve">SLIDE 4: ARSITEKTUR TEKNIS TERUJI &amp; DAMPAK BISNIS </w:t>
+              <w:t xml:space="preserve">SLIDE 3 | PUSAT DOKUMEN KEDINASAN PLN &amp; AI AGENT BRIDGE </w:t>
             </w:r>
             <w:r>
               <w:rPr>
                 <w:rFonts w:ascii="Calibri" w:hAnsi="Calibri"/>
+                <w:b/>
                 <w:color w:val="FDB813"/>
                 <w:sz w:val="20"/>
               </w:rPr>
-              <w:t>(~45 Detik)</w:t>
+              <w:t>[60 Detik]</w:t>
             </w:r>
           </w:p>
         </w:tc>
@@ -566,110 +738,414 @@
     </w:tbl>
     <w:p>
       <w:pPr>
-        <w:spacing w:after="40"/>
-      </w:pPr>
-    </w:p>
-    <w:p>
-      <w:pPr>
-        <w:spacing w:before="80" w:after="40"/>
+        <w:spacing w:before="120" w:after="40"/>
       </w:pPr>
       <w:r>
         <w:rPr>
           <w:rFonts w:ascii="Calibri" w:hAnsi="Calibri"/>
           <w:b/>
-          <w:i/>
           <w:color w:val="B45309"/>
           <w:sz w:val="19"/>
         </w:rPr>
-        <w:t>👉 [PANDUAN PANGGUNG]: Tatap seluruh dewan juri, nada bicara mantap dan berbobot. Sebutkan angka dampak (85%, Zero Data Discrepancy, 100%).</w:t>
+        <w:t>🎙️ Cara Ngomong &amp; Bahasa Tubuh: Arahkan pandangan ke juri, perlihatkan rasa percaya diri tinggi. Tunjukkan bahwa kamu paham regulasi kedinasan PLN dan kebutuhan masa depan (AI Agent).</w:t>
       </w:r>
+    </w:p>
+    <w:tbl>
+      <w:tblPr>
+        <w:tblW w:type="auto" w:w="0"/>
+        <w:jc w:val="center"/>
+        <w:tblLook w:firstColumn="1" w:firstRow="1" w:lastColumn="0" w:lastRow="0" w:noHBand="0" w:noVBand="1" w:val="04A0"/>
+      </w:tblPr>
+      <w:tblGrid>
+        <w:gridCol w:w="9648"/>
+      </w:tblGrid>
+      <w:tr>
+        <w:tc>
+          <w:tcPr>
+            <w:tcW w:type="dxa" w:w="9648"/>
+            <w:shd w:fill="F8FAFC"/>
+          </w:tcPr>
+          <w:p>
+            <w:pPr>
+              <w:spacing w:before="120" w:after="120" w:line="300" w:lineRule="auto"/>
+            </w:pPr>
+            <w:r>
+              <w:rPr>
+                <w:rFonts w:ascii="Georgia" w:hAnsi="Georgia"/>
+                <w:color w:val="0F172A"/>
+                <w:sz w:val="21"/>
+              </w:rPr>
+              <w:t>Di slide ketiga ini adalah fitur yang paling menarik dan berdampak langsung pada efisiensi staf PLN: Official Document Generator &amp; AI Agent Ready System.</w:t>
+              <w:br/>
+              <w:br/>
+              <w:t>Selama ini, pembuatan surat penagihan dan surat perintah kerja lapangan diketik manual di Microsoft Word satu per satu. Di aplikasi ini, staf admin cukup memilih ID Pelanggan atau nomor tiket, dan sistem langsung menghasilkan naskah dinas resmi dalam satu detik.</w:t>
+              <w:br/>
+              <w:br/>
+              <w:t>Ada 4 template standar BUMN yang kami siapkan: SP-1, SP-2, Surat Tugas YANTEK, dan Berita Acara P2TL. Penomoran suratnya otomatis mengikuti format kedinasan PLN, lengkap dengan konsideran dasar hukum Peraturan Menteri ESDM.</w:t>
+              <w:br/>
+              <w:br/>
+              <w:t>Kami juga membangun High-Precision A4 CSS Print Engine, sehingga saat diklik tombol 'Cetak Dokumen Resmi', browser langsung merender layout A4 presisi lengkap dengan kop dan tanda tangan tanpa perlu library pihak ketiga yang berat.</w:t>
+              <w:br/>
+              <w:br/>
+              <w:t>Dan yang paling penting: modul ini sudah kami lengkapi dengan output JSON Schema terstruktur dan service konversi teks WhatsApp. Artinya, sistem ini sudah AI-Agent Ready untuk dihubungkan ke LLM atau WhatsApp Gateway untuk broadcast notifikasi otomatis.</w:t>
+            </w:r>
+          </w:p>
+        </w:tc>
+      </w:tr>
+    </w:tbl>
+    <w:p>
+      <w:pPr>
+        <w:spacing w:after="80"/>
+      </w:pPr>
     </w:p>
     <w:p>
       <w:pPr>
-        <w:spacing w:before="40" w:after="200" w:line="300" w:lineRule="auto"/>
-      </w:pPr>
-      <w:r>
-        <w:rPr>
-          <w:rFonts w:ascii="Georgia" w:hAnsi="Georgia"/>
-          <w:color w:val="1E293B"/>
-          <w:sz w:val="22"/>
-        </w:rPr>
-        <w:t>"Sebagai penutup di slide terakhir ini, kami ingin menegaskan bahwa sistem admin ini dibangun di atas fondasi rekayasa perangkat lunak yang kokoh.</w:t>
-        <w:br/>
-        <w:br/>
-        <w:t>Dengan arsitektur Laravel 13 MVC, database ternormalisasi Third Normal Form (3NF), serta antarmuka reaktif Tailwind dan Alpine.js, sistem kami terbukti ringan, cepat, dan siap diskalakan ke jutaan pelanggan.</w:t>
-        <w:br/>
-        <w:br/>
-        <w:t>Dampak nyatanya terukur:</w:t>
-        <w:br/>
-        <w:t>1. Efisiensi Waktu Operasional hingga 85%: dari pembuatan naskah dinas manual hingga triase penugasan teknisi lapangan.</w:t>
-        <w:br/>
-        <w:t>2. Zero Data Discrepancy: tidak ada lagi data tagihan atau tiket padam yang tercecer antara pelanggan dan kantor operasional.</w:t>
-        <w:br/>
-        <w:t>3. Dan Kepatuhan Digital 100% terhadap standar tata kelola BUMN.</w:t>
-        <w:br/>
-        <w:br/>
-        <w:t>Inilah wujud nyata digitalisasi utilitas kelistrikan: bukan sekadar mempercantik tampilan, melainkan mentransformasi operasional menjadi lebih cepat, akurat, dan transparan."</w:t>
-      </w:r>
-    </w:p>
-    <w:p>
-      <w:pPr>
-        <w:spacing w:before="280" w:after="120"/>
+        <w:spacing w:before="120" w:after="40"/>
       </w:pPr>
       <w:r>
         <w:rPr>
           <w:rFonts w:ascii="Calibri" w:hAnsi="Calibri"/>
           <w:b/>
           <w:color w:val="00529C"/>
-          <w:sz w:val="28"/>
+          <w:sz w:val="20"/>
         </w:rPr>
-        <w:t>5. Transisi Penutup (Kembalikan ke Moderator / Q&amp;A)</w:t>
+        <w:t>⚙️ Bedah Teknis &amp; Kode Terkait: Algoritma Nomor Surat Resmi &amp; Formatter WhatsApp Service</w:t>
       </w:r>
     </w:p>
+    <w:tbl>
+      <w:tblPr>
+        <w:tblW w:type="auto" w:w="0"/>
+        <w:jc w:val="center"/>
+        <w:tblLook w:firstColumn="1" w:firstRow="1" w:lastColumn="0" w:lastRow="0" w:noHBand="0" w:noVBand="1" w:val="04A0"/>
+      </w:tblPr>
+      <w:tblGrid>
+        <w:gridCol w:w="9648"/>
+      </w:tblGrid>
+      <w:tr>
+        <w:tc>
+          <w:tcPr>
+            <w:tcW w:type="dxa" w:w="9648"/>
+            <w:shd w:fill="0F172A"/>
+          </w:tcPr>
+          <w:p>
+            <w:pPr>
+              <w:spacing w:before="80" w:after="40"/>
+            </w:pPr>
+            <w:r>
+              <w:rPr>
+                <w:rFonts w:ascii="Consolas" w:hAnsi="Consolas"/>
+                <w:color w:val="94A3B8"/>
+                <w:sz w:val="17"/>
+              </w:rPr>
+              <w:t>// File: app/Http/Controllers/Admin/AdminController.php &amp; LetterFormatterService.php</w:t>
+            </w:r>
+          </w:p>
+          <w:p>
+            <w:pPr>
+              <w:spacing w:before="0" w:after="80"/>
+            </w:pPr>
+            <w:r>
+              <w:rPr>
+                <w:rFonts w:ascii="Consolas" w:hAnsi="Consolas"/>
+                <w:color w:val="E2E8F0"/>
+                <w:sz w:val="17"/>
+              </w:rPr>
+              <w:t>$nomorSurat = match ($type) {</w:t>
+              <w:br/>
+              <w:t xml:space="preserve">    'sp1'      =&gt; '041/DIS.01.02/ULP-JKT/SP-1/' . now()-&gt;format('Y'),</w:t>
+              <w:br/>
+              <w:t xml:space="preserve">    'sp2'      =&gt; '082/DIS.01.02/ULP-JKT/SP-2/' . now()-&gt;format('Y'),</w:t>
+              <w:br/>
+              <w:t xml:space="preserve">    'spk'      =&gt; '115/YANTEK/GANGGUAN/' . now()-&gt;format('Y'),</w:t>
+              <w:br/>
+              <w:t xml:space="preserve">    'ba_meter' =&gt; '204/BA-P2TL/METER/' . now()-&gt;format('Y'),</w:t>
+              <w:br/>
+              <w:t>};</w:t>
+              <w:br/>
+              <w:br/>
+              <w:t>// Export siap kirim via WhatsApp Gateway / AI Agent</w:t>
+              <w:br/>
+              <w:t>$content = LetterFormatterService::toWhatsApp($type, $bill, $outage);</w:t>
+            </w:r>
+          </w:p>
+        </w:tc>
+      </w:tr>
+    </w:tbl>
     <w:p>
       <w:pPr>
-        <w:spacing w:before="80" w:after="40"/>
+        <w:spacing w:before="60" w:after="200"/>
+      </w:pPr>
+      <w:r>
+        <w:rPr>
+          <w:rFonts w:ascii="Calibri" w:hAnsi="Calibri"/>
+          <w:i/>
+          <w:color w:val="475569"/>
+          <w:sz w:val="18"/>
+        </w:rPr>
+        <w:t>Poin teknis untuk dijelaskan jika juri bertanya: Pola penomoran mengacu pada tata naskah dinas resmi PT PLN (Persero). Konten dapat diunduh dalam format teks bersih atau format WhatsApp Markdown (*bold*, _italic_) siap integrasi API.</w:t>
+      </w:r>
+    </w:p>
+    <w:tbl>
+      <w:tblPr>
+        <w:tblW w:type="auto" w:w="0"/>
+        <w:jc w:val="center"/>
+        <w:tblLook w:firstColumn="1" w:firstRow="1" w:lastColumn="0" w:lastRow="0" w:noHBand="0" w:noVBand="1" w:val="04A0"/>
+      </w:tblPr>
+      <w:tblGrid>
+        <w:gridCol w:w="9648"/>
+      </w:tblGrid>
+      <w:tr>
+        <w:tc>
+          <w:tcPr>
+            <w:tcW w:type="dxa" w:w="9648"/>
+            <w:shd w:fill="00265A"/>
+          </w:tcPr>
+          <w:p>
+            <w:pPr>
+              <w:spacing w:before="120" w:after="120"/>
+            </w:pPr>
+            <w:r>
+              <w:rPr>
+                <w:rFonts w:ascii="Calibri" w:hAnsi="Calibri"/>
+                <w:b/>
+                <w:color w:val="FFFFFF"/>
+                <w:sz w:val="22"/>
+              </w:rPr>
+              <w:t xml:space="preserve">SLIDE 4 | ARSITEKTUR DATABASE, KEAMANAN &amp; DAMPAK EFISIENSI </w:t>
+            </w:r>
+            <w:r>
+              <w:rPr>
+                <w:rFonts w:ascii="Calibri" w:hAnsi="Calibri"/>
+                <w:b/>
+                <w:color w:val="FDB813"/>
+                <w:sz w:val="20"/>
+              </w:rPr>
+              <w:t>[45 Detik]</w:t>
+            </w:r>
+          </w:p>
+        </w:tc>
+      </w:tr>
+    </w:tbl>
+    <w:p>
+      <w:pPr>
+        <w:spacing w:before="120" w:after="40"/>
       </w:pPr>
       <w:r>
         <w:rPr>
           <w:rFonts w:ascii="Calibri" w:hAnsi="Calibri"/>
           <w:b/>
-          <w:i/>
           <w:color w:val="B45309"/>
           <w:sz w:val="19"/>
         </w:rPr>
-        <w:t>👉 [PANDUAN PANGGUNG]: Membungkuk hormat sedikit, tersenyum percaya diri, lalu oper ke rekan.</w:t>
+        <w:t>🎙️ Cara Ngomong &amp; Bahasa Tubuh: Tutup dengan nada lugas, tatap juri, lalu beri senyuman dan kembalikan giliran ke moderator atau rekan.</w:t>
       </w:r>
+    </w:p>
+    <w:tbl>
+      <w:tblPr>
+        <w:tblW w:type="auto" w:w="0"/>
+        <w:jc w:val="center"/>
+        <w:tblLook w:firstColumn="1" w:firstRow="1" w:lastColumn="0" w:lastRow="0" w:noHBand="0" w:noVBand="1" w:val="04A0"/>
+      </w:tblPr>
+      <w:tblGrid>
+        <w:gridCol w:w="9648"/>
+      </w:tblGrid>
+      <w:tr>
+        <w:tc>
+          <w:tcPr>
+            <w:tcW w:type="dxa" w:w="9648"/>
+            <w:shd w:fill="F8FAFC"/>
+          </w:tcPr>
+          <w:p>
+            <w:pPr>
+              <w:spacing w:before="120" w:after="120" w:line="300" w:lineRule="auto"/>
+            </w:pPr>
+            <w:r>
+              <w:rPr>
+                <w:rFonts w:ascii="Georgia" w:hAnsi="Georgia"/>
+                <w:color w:val="0F172A"/>
+                <w:sz w:val="21"/>
+              </w:rPr>
+              <w:t>Sebagai penutup di slide keempat, mari kita lihat fondasi rekayasa di balik sistem ini.</w:t>
+              <w:br/>
+              <w:br/>
+              <w:t>Kami merancang skema database ternormalisasi Third Normal Form (3NF) dengan 11 tabel berelasi kuat. Foreign key constraints dipasang dengan aturan 'ON DELETE RESTRICT' pada tabel tagihan dan transaksi untuk menjaga audit trail dan mencegah manipulasi data finansial.</w:t>
+              <w:br/>
+              <w:br/>
+              <w:t>Frontend admin dibangun dengan kombinasi Tailwind CSS dan Alpine.js reaktif untuk state management form generator surat tanpa perlu me-reload halaman.</w:t>
+              <w:br/>
+              <w:br/>
+              <w:t>Dari sisi dampak nyata: waktu pembuatan surat administrasi berkurang hingga 85%, transparansi data konsumsi kWh meningkat, dan penanganan gangguan lapangan menjadi terukur.</w:t>
+              <w:br/>
+              <w:br/>
+              <w:t>Inilah kontribusi kami dalam menghadirkan platform digital yang kokoh, patuh regulasi, dan siap pakai untuk PLN. Sekian dari saya, terima kasih!</w:t>
+            </w:r>
+          </w:p>
+        </w:tc>
+      </w:tr>
+    </w:tbl>
+    <w:p>
+      <w:pPr>
+        <w:spacing w:after="80"/>
+      </w:pPr>
     </w:p>
     <w:p>
       <w:pPr>
-        <w:spacing w:before="40" w:after="200" w:line="300" w:lineRule="auto"/>
-      </w:pPr>
-      <w:r>
-        <w:rPr>
-          <w:rFonts w:ascii="Georgia" w:hAnsi="Georgia"/>
-          <w:color w:val="1E293B"/>
-          <w:sz w:val="22"/>
-        </w:rPr>
-        <w:t>"Demikian paparan dari sisi Backoffice Command Center PLN DIGI.</w:t>
-        <w:br/>
-        <w:t>Sekarang, saya kembalikan kepada rekan saya / moderator untuk sesi berikutnya.</w:t>
-        <w:br/>
-        <w:t>Terima kasih banyak atas perhatian Bapak dan Ibu Dewan Juri yang terhormat!"</w:t>
-      </w:r>
-    </w:p>
-    <w:p>
-      <w:pPr>
-        <w:spacing w:before="280" w:after="120"/>
+        <w:spacing w:before="120" w:after="40"/>
       </w:pPr>
       <w:r>
         <w:rPr>
           <w:rFonts w:ascii="Calibri" w:hAnsi="Calibri"/>
           <w:b/>
           <w:color w:val="00529C"/>
-          <w:sz w:val="28"/>
+          <w:sz w:val="20"/>
         </w:rPr>
-        <w:t>6. Cheat Sheet Jawaban Tanya-Jawab Juri (Q&amp;A)</w:t>
+        <w:t>⚙️ Bedah Teknis &amp; Kode Terkait: Integritas Skema Relasi Database &amp; State Management Alpine.js</w:t>
+      </w:r>
+    </w:p>
+    <w:tbl>
+      <w:tblPr>
+        <w:tblW w:type="auto" w:w="0"/>
+        <w:jc w:val="center"/>
+        <w:tblLook w:firstColumn="1" w:firstRow="1" w:lastColumn="0" w:lastRow="0" w:noHBand="0" w:noVBand="1" w:val="04A0"/>
+      </w:tblPr>
+      <w:tblGrid>
+        <w:gridCol w:w="9648"/>
+      </w:tblGrid>
+      <w:tr>
+        <w:tc>
+          <w:tcPr>
+            <w:tcW w:type="dxa" w:w="9648"/>
+            <w:shd w:fill="0F172A"/>
+          </w:tcPr>
+          <w:p>
+            <w:pPr>
+              <w:spacing w:before="80" w:after="40"/>
+            </w:pPr>
+            <w:r>
+              <w:rPr>
+                <w:rFonts w:ascii="Consolas" w:hAnsi="Consolas"/>
+                <w:color w:val="94A3B8"/>
+                <w:sz w:val="17"/>
+              </w:rPr>
+              <w:t>// File: database/migrations/* &amp; resources/views/admin/letters.blade.php</w:t>
+            </w:r>
+          </w:p>
+          <w:p>
+            <w:pPr>
+              <w:spacing w:before="0" w:after="80"/>
+            </w:pPr>
+            <w:r>
+              <w:rPr>
+                <w:rFonts w:ascii="Consolas" w:hAnsi="Consolas"/>
+                <w:color w:val="E2E8F0"/>
+                <w:sz w:val="17"/>
+              </w:rPr>
+              <w:t>// Migration: Foreign key constraint integritas finansial</w:t>
+              <w:br/>
+              <w:t>$table-&gt;foreignId('customer_id')-&gt;constrained('customers')-&gt;onDelete('restrict');</w:t>
+              <w:br/>
+              <w:t>$table-&gt;foreignId('tariff_id')-&gt;constrained('tariffs')-&gt;onDelete('restrict');</w:t>
+              <w:br/>
+              <w:br/>
+              <w:t>// Alpine.js: Reaktif state surat instan tanpa reload</w:t>
+              <w:br/>
+              <w:t>&lt;section x-data="letterGenerator()"&gt;</w:t>
+              <w:br/>
+              <w:t xml:space="preserve">  &lt;select x-model="selectedType" @change="updatePreview()"&gt;</w:t>
+              <w:br/>
+              <w:t xml:space="preserve">  &lt;button @click="window.print()"&gt;Cetak A4 Resmi&lt;/button&gt;</w:t>
+              <w:br/>
+              <w:t>&lt;/section&gt;</w:t>
+            </w:r>
+          </w:p>
+        </w:tc>
+      </w:tr>
+    </w:tbl>
+    <w:p>
+      <w:pPr>
+        <w:spacing w:before="60" w:after="200"/>
+      </w:pPr>
+      <w:r>
+        <w:rPr>
+          <w:rFonts w:ascii="Calibri" w:hAnsi="Calibri"/>
+          <w:i/>
+          <w:color w:val="475569"/>
+          <w:sz w:val="18"/>
+        </w:rPr>
+        <w:t>Poin teknis untuk dijelaskan jika juri bertanya: Constraint 'restrict' memastikan tidak ada riwayat tagihan atau pelanggan yang terhapus sepihak jika masih memiliki transaksi, menjaga kepatuhan Good Corporate Governance.</w:t>
+      </w:r>
+    </w:p>
+    <w:p>
+      <w:r>
+        <w:br w:type="page"/>
+      </w:r>
+    </w:p>
+    <w:tbl>
+      <w:tblPr>
+        <w:tblW w:type="auto" w:w="0"/>
+        <w:jc w:val="center"/>
+        <w:tblLook w:firstColumn="1" w:firstRow="1" w:lastColumn="0" w:lastRow="0" w:noHBand="0" w:noVBand="1" w:val="04A0"/>
+      </w:tblPr>
+      <w:tblGrid>
+        <w:gridCol w:w="9648"/>
+      </w:tblGrid>
+      <w:tr>
+        <w:tc>
+          <w:tcPr>
+            <w:tcW w:type="dxa" w:w="9648"/>
+            <w:shd w:fill="00265A"/>
+          </w:tcPr>
+          <w:p>
+            <w:pPr>
+              <w:spacing w:before="120" w:after="120"/>
+            </w:pPr>
+            <w:r>
+              <w:rPr>
+                <w:rFonts w:ascii="Calibri" w:hAnsi="Calibri"/>
+                <w:b/>
+                <w:color w:val="FFFFFF"/>
+                <w:sz w:val="22"/>
+              </w:rPr>
+              <w:t xml:space="preserve">SLIDE Q&amp;A | PANDUAN MENJAWAB PERTANYAAN TEKNIS JURI </w:t>
+            </w:r>
+            <w:r>
+              <w:rPr>
+                <w:rFonts w:ascii="Calibri" w:hAnsi="Calibri"/>
+                <w:b/>
+                <w:color w:val="FDB813"/>
+                <w:sz w:val="20"/>
+              </w:rPr>
+              <w:t>[Sesi Tanya Jawab]</w:t>
+            </w:r>
+          </w:p>
+        </w:tc>
+      </w:tr>
+    </w:tbl>
+    <w:p>
+      <w:pPr>
+        <w:spacing w:before="160" w:after="40"/>
+      </w:pPr>
+      <w:r>
+        <w:rPr>
+          <w:rFonts w:ascii="Calibri" w:hAnsi="Calibri"/>
+          <w:b/>
+          <w:color w:val="00265A"/>
+          <w:sz w:val="20"/>
+        </w:rPr>
+        <w:t>Juri: 'Bagaimana sistem menangani ribuan transaksi bersamaan agar tidak lambat?'</w:t>
+      </w:r>
+    </w:p>
+    <w:p>
+      <w:pPr>
+        <w:spacing w:before="0" w:after="120" w:line="288" w:lineRule="auto"/>
+      </w:pPr>
+      <w:r>
+        <w:rPr>
+          <w:rFonts w:ascii="Georgia" w:hAnsi="Georgia"/>
+          <w:color w:val="0F172A"/>
+          <w:sz w:val="19"/>
+        </w:rPr>
+        <w:t>Jawaban Hafizh: 'Kami menerapkan 3 hal teknis, Pak/Bu. Pertama, seluruh query foreign key seperti customer_id dan bill_id sudah kami beri index di database migration. Kedua, di level Eloquent kami selalu menggunakan Eager Loading with() untuk mencegah N+1 problem. Ketiga, query pencarian pelanggan dan transaksi menggunakan pagination server-side paginate(15) sehingga memory footprint PHP tetap sangat kecil.'</w:t>
       </w:r>
     </w:p>
     <w:p>
@@ -680,23 +1156,23 @@
         <w:rPr>
           <w:rFonts w:ascii="Calibri" w:hAnsi="Calibri"/>
           <w:b/>
-          <w:color w:val="001A4D"/>
-          <w:sz w:val="21"/>
+          <w:color w:val="00265A"/>
+          <w:sz w:val="20"/>
         </w:rPr>
-        <w:t>Q1: Bagaimana kalian menjamin keamanan data pelanggan di dashboard admin?</w:t>
+        <w:t>Juri: 'Kenapa menggunakan CSS Print Engine dibanding library PDF seperti DomPDF?'</w:t>
       </w:r>
     </w:p>
     <w:p>
       <w:pPr>
-        <w:spacing w:before="0" w:after="120"/>
+        <w:spacing w:before="0" w:after="120" w:line="288" w:lineRule="auto"/>
       </w:pPr>
       <w:r>
         <w:rPr>
           <w:rFonts w:ascii="Georgia" w:hAnsi="Georgia"/>
-          <w:color w:val="1E293B"/>
-          <w:sz w:val="20"/>
+          <w:color w:val="0F172A"/>
+          <w:sz w:val="19"/>
         </w:rPr>
-        <w:t>Jawaban Hafizh: "Kami menerapkan prinsip defense-in-depth, Pak/Bu. Pertama, autentikasi dilindungi oleh Role-Based Middleware (AdminMiddleware), sehingga akun pelanggan biasa tidak akan pernah bisa mengakses endpoint /admin. Kedua, seluruh password di-hash menggunakan algoritma Bcrypt standar industri. Ketiga, query database menggunakan Eloquent ORM dengan parameter binding sehingga 100% terlindung dari serangan SQL Injection."</w:t>
+        <w:t>Jawaban Hafizh: 'Pertama, efisiensi resource server: library PDF berbasis PHP seperti DomPDF atau Puppeteer membutuhkan memory dan CPU yang tinggi saat mengonversi CSS modern. Dengan CSS Print Engine native (@media print dan @page A4), proses rendering diserahkan sepenuhnya ke engine browser klien. Hasilnya nol beban server, cetakan 100% vektor tajam, dan tetap bisa di-Save as PDF tanpa perlu package tambahan.'</w:t>
       </w:r>
     </w:p>
     <w:p>
@@ -707,55 +1183,28 @@
         <w:rPr>
           <w:rFonts w:ascii="Calibri" w:hAnsi="Calibri"/>
           <w:b/>
-          <w:color w:val="001A4D"/>
-          <w:sz w:val="21"/>
+          <w:color w:val="00265A"/>
+          <w:sz w:val="20"/>
         </w:rPr>
-        <w:t>Q2: Kenapa perlu ada fitur AI-Ready Document Generator? Mengapa tidak pakai template cetak biasa?</w:t>
+        <w:t>Juri: 'Bagaimana peran AI Agent dalam modul surat kedinasan ini?'</w:t>
       </w:r>
     </w:p>
     <w:p>
       <w:pPr>
-        <w:spacing w:before="0" w:after="120"/>
+        <w:spacing w:before="0" w:after="120" w:line="288" w:lineRule="auto"/>
       </w:pPr>
       <w:r>
         <w:rPr>
           <w:rFonts w:ascii="Georgia" w:hAnsi="Georgia"/>
-          <w:color w:val="1E293B"/>
-          <w:sz w:val="20"/>
+          <w:color w:val="0F172A"/>
+          <w:sz w:val="19"/>
         </w:rPr>
-        <w:t>Jawaban Hafizh: "Tantangan di lapangan adalah setiap kasus pelanggan itu unik—ada pelanggan yang menunggak 1 bulan, ada yang menunggak beserta denda, dan ada lokasi padam yang membutuhkan penanganan darurat spesifik. Dengan arsitektur JSON Schema AI-Ready, AI Agent dapat membaca konteks data pelanggan secara presisi lalu merangkai narasi surat atau pesan WhatsApp broadcast yang sopan, solutif, namun tetap tegas dan berpayung hukum ESDM, tanpa risiko salah ketik oleh manusia."</w:t>
-      </w:r>
-    </w:p>
-    <w:p>
-      <w:pPr>
-        <w:spacing w:before="160" w:after="40"/>
-      </w:pPr>
-      <w:r>
-        <w:rPr>
-          <w:rFonts w:ascii="Calibri" w:hAnsi="Calibri"/>
-          <w:b/>
-          <w:color w:val="001A4D"/>
-          <w:sz w:val="21"/>
-        </w:rPr>
-        <w:t>Q3: Bagaimana cara sistem mendeteksi anomali pada pencatatan SwaCAM?</w:t>
-      </w:r>
-    </w:p>
-    <w:p>
-      <w:pPr>
-        <w:spacing w:before="0" w:after="120"/>
-      </w:pPr>
-      <w:r>
-        <w:rPr>
-          <w:rFonts w:ascii="Georgia" w:hAnsi="Georgia"/>
-          <w:color w:val="1E293B"/>
-          <w:sz w:val="20"/>
-        </w:rPr>
-        <w:t>Jawaban Hafizh: "Sistem kami membandingkan angka stand meter yang diinput pelanggan dengan batas rata-rata historis golongan dayanya. Jika konsumsi melebihi 400 kWh per bulan untuk golongan rumah tangga kecil, atau jika angkanya justru lebih rendah dari angka bulan lalu (indikasi meteran macet atau salah baca), sistem admin secara otomatis menyematkan label 'Anomali Terdeteksi' agar petugas melakukan kroscek sebelum tagihan dicetak."</w:t>
+        <w:t>Jawaban Hafizh: 'Modul surat kami berfungsi sebagai data bridge. Kami menyediakan endpoint terstruktur yang membungkus riwayat tunggakan, denda, dan data pelanggan ke format JSON Schema yang baku. Payload ini siap dikonsumsi oleh LLM (AI Agent) untuk mengkustomisasi kalimat penagihan persuasif atau peringatan tegas sesuai profil pelanggan, lalu ditembakkan langsung ke WhatsApp Gateway.'</w:t>
       </w:r>
     </w:p>
     <w:sectPr>
       <w:pgSz w:w="12240" w:h="15840"/>
-      <w:pgMar w:top="1440" w:right="1440" w:bottom="1440" w:left="1440" w:header="720" w:footer="720" w:gutter="0"/>
+      <w:pgMar w:top="1152" w:right="1296" w:bottom="1152" w:left="1296" w:header="720" w:footer="720" w:gutter="0"/>
       <w:cols w:space="720"/>
       <w:docGrid w:linePitch="360"/>
     </w:sectPr>

</xml_diff>